<commit_message>
Adicionando Resquisitos funcionais e suplementares
</commit_message>
<xml_diff>
--- a/SistemaGestãoConcretaDSC.docx
+++ b/SistemaGestãoConcretaDSC.docx
@@ -231,7 +231,7 @@
       <w:pPr>
         <w:numPr>
           <w:ilvl w:val="0"/>
-          <w:numId w:val="1"/>
+          <w:numId w:val="2"/>
         </w:numPr>
         <w:ind w:left="720" w:hanging="360"/>
         <w:jc w:val="both"/>
@@ -561,7 +561,7 @@
       <w:pPr>
         <w:numPr>
           <w:ilvl w:val="0"/>
-          <w:numId w:val="1"/>
+          <w:numId w:val="2"/>
         </w:numPr>
         <w:ind w:left="720" w:hanging="360"/>
         <w:jc w:val="both"/>
@@ -612,12 +612,12 @@
           <wp:inline distB="114300" distT="114300" distL="114300" distR="114300">
             <wp:extent cx="5057775" cy="5915025"/>
             <wp:effectExtent b="0" l="0" r="0" t="0"/>
-            <wp:docPr id="1" name="image1.png"/>
+            <wp:docPr id="1" name="image2.png"/>
             <a:graphic>
               <a:graphicData uri="http://schemas.openxmlformats.org/drawingml/2006/picture">
                 <pic:pic>
                   <pic:nvPicPr>
-                    <pic:cNvPr id="0" name="image1.png"/>
+                    <pic:cNvPr id="0" name="image2.png"/>
                     <pic:cNvPicPr preferRelativeResize="0"/>
                   </pic:nvPicPr>
                   <pic:blipFill>
@@ -831,7 +831,7 @@
       <w:pPr>
         <w:numPr>
           <w:ilvl w:val="0"/>
-          <w:numId w:val="1"/>
+          <w:numId w:val="2"/>
         </w:numPr>
         <w:ind w:left="720" w:hanging="360"/>
         <w:jc w:val="both"/>
@@ -882,12 +882,12 @@
           <wp:inline distB="114300" distT="114300" distL="114300" distR="114300">
             <wp:extent cx="5291138" cy="5534025"/>
             <wp:effectExtent b="0" l="0" r="0" t="0"/>
-            <wp:docPr id="4" name="image2.png"/>
+            <wp:docPr id="4" name="image1.png"/>
             <a:graphic>
               <a:graphicData uri="http://schemas.openxmlformats.org/drawingml/2006/picture">
                 <pic:pic>
                   <pic:nvPicPr>
-                    <pic:cNvPr id="0" name="image2.png"/>
+                    <pic:cNvPr id="0" name="image1.png"/>
                     <pic:cNvPicPr preferRelativeResize="0"/>
                   </pic:nvPicPr>
                   <pic:blipFill>
@@ -1131,7 +1131,7 @@
       <w:pPr>
         <w:numPr>
           <w:ilvl w:val="0"/>
-          <w:numId w:val="1"/>
+          <w:numId w:val="2"/>
         </w:numPr>
         <w:ind w:left="720" w:hanging="360"/>
         <w:jc w:val="both"/>
@@ -1256,17 +1256,443 @@
           <w:szCs w:val="24"/>
         </w:rPr>
       </w:pPr>
-      <w:bookmarkStart w:colFirst="0" w:colLast="0" w:name="_oe5dix6q4suq" w:id="1"/>
+      <w:bookmarkStart w:colFirst="0" w:colLast="0" w:name="_xx6b2xdq8yzv" w:id="1"/>
       <w:bookmarkEnd w:id="1"/>
       <w:r>
+        <w:rPr>
+          <w:rtl w:val="0"/>
+        </w:rPr>
+      </w:r>
+    </w:p>
+    <w:p>
+      <w:pPr>
+        <w:pStyle w:val="Heading2"/>
+        <w:keepNext w:val="0"/>
+        <w:keepLines w:val="0"/>
+        <w:spacing w:after="80" w:lineRule="auto"/>
+        <w:jc w:val="both"/>
         <w:rPr>
           <w:b w:val="1"/>
           <w:bCs w:val="1"/>
           <w:sz w:val="24"/>
           <w:szCs w:val="24"/>
+        </w:rPr>
+      </w:pPr>
+      <w:bookmarkStart w:colFirst="0" w:colLast="0" w:name="_jgj9zgnxllw4" w:id="2"/>
+      <w:bookmarkEnd w:id="2"/>
+      <w:r>
+        <w:rPr>
+          <w:rtl w:val="0"/>
+        </w:rPr>
+      </w:r>
+    </w:p>
+    <w:p>
+      <w:pPr>
+        <w:pStyle w:val="Heading2"/>
+        <w:keepNext w:val="0"/>
+        <w:keepLines w:val="0"/>
+        <w:spacing w:after="80" w:lineRule="auto"/>
+        <w:jc w:val="both"/>
+        <w:rPr>
+          <w:b w:val="1"/>
+          <w:bCs w:val="1"/>
+          <w:sz w:val="24"/>
+          <w:szCs w:val="24"/>
+        </w:rPr>
+      </w:pPr>
+      <w:bookmarkStart w:colFirst="0" w:colLast="0" w:name="_sglvwbbdoy11" w:id="3"/>
+      <w:bookmarkEnd w:id="3"/>
+      <w:r>
+        <w:rPr>
+          <w:rtl w:val="0"/>
+        </w:rPr>
+      </w:r>
+    </w:p>
+    <w:p>
+      <w:pPr>
+        <w:pStyle w:val="Heading2"/>
+        <w:keepNext w:val="0"/>
+        <w:keepLines w:val="0"/>
+        <w:spacing w:after="80" w:lineRule="auto"/>
+        <w:jc w:val="both"/>
+        <w:rPr>
+          <w:b w:val="1"/>
+          <w:bCs w:val="1"/>
+          <w:sz w:val="24"/>
+          <w:szCs w:val="24"/>
+        </w:rPr>
+      </w:pPr>
+      <w:bookmarkStart w:colFirst="0" w:colLast="0" w:name="_s3xxqb4myall" w:id="4"/>
+      <w:bookmarkEnd w:id="4"/>
+      <w:r>
+        <w:rPr>
+          <w:rtl w:val="0"/>
+        </w:rPr>
+      </w:r>
+    </w:p>
+    <w:p>
+      <w:pPr>
+        <w:pStyle w:val="Heading2"/>
+        <w:keepNext w:val="0"/>
+        <w:keepLines w:val="0"/>
+        <w:spacing w:after="80" w:lineRule="auto"/>
+        <w:jc w:val="both"/>
+        <w:rPr>
+          <w:b w:val="1"/>
+          <w:bCs w:val="1"/>
+          <w:sz w:val="24"/>
+          <w:szCs w:val="24"/>
+        </w:rPr>
+      </w:pPr>
+      <w:bookmarkStart w:colFirst="0" w:colLast="0" w:name="_oe5dix6q4suq" w:id="5"/>
+      <w:bookmarkEnd w:id="5"/>
+      <w:r>
+        <w:rPr>
+          <w:b w:val="1"/>
+          <w:bCs w:val="1"/>
+          <w:sz w:val="24"/>
+          <w:szCs w:val="24"/>
           <w:rtl w:val="0"/>
         </w:rPr>
         <w:t xml:space="preserve">Gestão Concreta - Documentos de Requisitos</w:t>
+      </w:r>
+    </w:p>
+    <w:p>
+      <w:pPr>
+        <w:spacing w:after="200" w:before="200" w:lineRule="auto"/>
+        <w:jc w:val="both"/>
+        <w:rPr>
+          <w:b w:val="1"/>
+          <w:bCs w:val="1"/>
+          <w:sz w:val="24"/>
+          <w:szCs w:val="24"/>
+        </w:rPr>
+      </w:pPr>
+      <w:r>
+        <w:rPr>
+          <w:b w:val="1"/>
+          <w:bCs w:val="1"/>
+          <w:sz w:val="24"/>
+          <w:szCs w:val="24"/>
+          <w:rtl w:val="0"/>
+        </w:rPr>
+        <w:t xml:space="preserve">   Requisitos funcionais </w:t>
+      </w:r>
+    </w:p>
+    <w:p>
+      <w:pPr>
+        <w:numPr>
+          <w:ilvl w:val="0"/>
+          <w:numId w:val="1"/>
+        </w:numPr>
+        <w:ind w:left="720" w:hanging="360"/>
+        <w:jc w:val="both"/>
+        <w:rPr>
+          <w:sz w:val="24"/>
+          <w:szCs w:val="24"/>
+        </w:rPr>
+      </w:pPr>
+      <w:r>
+        <w:rPr>
+          <w:sz w:val="24"/>
+          <w:szCs w:val="24"/>
+          <w:rtl w:val="0"/>
+        </w:rPr>
+        <w:t xml:space="preserve">RF01 – Realizar Login </w:t>
+      </w:r>
+      <w:r>
+        <w:rPr>
+          <w:rtl w:val="0"/>
+        </w:rPr>
+      </w:r>
+    </w:p>
+    <w:p>
+      <w:pPr>
+        <w:numPr>
+          <w:ilvl w:val="0"/>
+          <w:numId w:val="1"/>
+        </w:numPr>
+        <w:ind w:left="720" w:hanging="360"/>
+        <w:jc w:val="both"/>
+        <w:rPr>
+          <w:sz w:val="24"/>
+          <w:szCs w:val="24"/>
+        </w:rPr>
+      </w:pPr>
+      <w:r>
+        <w:rPr>
+          <w:sz w:val="24"/>
+          <w:szCs w:val="24"/>
+          <w:rtl w:val="0"/>
+        </w:rPr>
+        <w:t xml:space="preserve">RF02 – Gerenciar Usuários </w:t>
+      </w:r>
+      <w:r>
+        <w:rPr>
+          <w:rtl w:val="0"/>
+        </w:rPr>
+      </w:r>
+    </w:p>
+    <w:p>
+      <w:pPr>
+        <w:numPr>
+          <w:ilvl w:val="0"/>
+          <w:numId w:val="1"/>
+        </w:numPr>
+        <w:ind w:left="720" w:hanging="360"/>
+        <w:jc w:val="both"/>
+        <w:rPr>
+          <w:sz w:val="24"/>
+          <w:szCs w:val="24"/>
+        </w:rPr>
+      </w:pPr>
+      <w:r>
+        <w:rPr>
+          <w:sz w:val="24"/>
+          <w:szCs w:val="24"/>
+          <w:rtl w:val="0"/>
+        </w:rPr>
+        <w:t xml:space="preserve">RF03 – Gerenciar Produtos </w:t>
+      </w:r>
+      <w:r>
+        <w:rPr>
+          <w:rtl w:val="0"/>
+        </w:rPr>
+      </w:r>
+    </w:p>
+    <w:p>
+      <w:pPr>
+        <w:numPr>
+          <w:ilvl w:val="0"/>
+          <w:numId w:val="1"/>
+        </w:numPr>
+        <w:ind w:left="720" w:hanging="360"/>
+        <w:jc w:val="both"/>
+        <w:rPr>
+          <w:sz w:val="24"/>
+          <w:szCs w:val="24"/>
+        </w:rPr>
+      </w:pPr>
+      <w:r>
+        <w:rPr>
+          <w:sz w:val="24"/>
+          <w:szCs w:val="24"/>
+          <w:rtl w:val="0"/>
+        </w:rPr>
+        <w:t xml:space="preserve">RF04 – Registrar Vendas </w:t>
+      </w:r>
+      <w:r>
+        <w:rPr>
+          <w:rtl w:val="0"/>
+        </w:rPr>
+      </w:r>
+    </w:p>
+    <w:p>
+      <w:pPr>
+        <w:numPr>
+          <w:ilvl w:val="0"/>
+          <w:numId w:val="1"/>
+        </w:numPr>
+        <w:ind w:left="720" w:hanging="360"/>
+        <w:jc w:val="both"/>
+        <w:rPr>
+          <w:sz w:val="24"/>
+          <w:szCs w:val="24"/>
+        </w:rPr>
+      </w:pPr>
+      <w:r>
+        <w:rPr>
+          <w:sz w:val="24"/>
+          <w:szCs w:val="24"/>
+          <w:rtl w:val="0"/>
+        </w:rPr>
+        <w:t xml:space="preserve">RF05 – Gerar Relatórios Gerenciais </w:t>
+      </w:r>
+      <w:r>
+        <w:rPr>
+          <w:rtl w:val="0"/>
+        </w:rPr>
+      </w:r>
+    </w:p>
+    <w:p>
+      <w:pPr>
+        <w:spacing w:after="200" w:before="200" w:lineRule="auto"/>
+        <w:jc w:val="both"/>
+        <w:rPr>
+          <w:b w:val="1"/>
+          <w:bCs w:val="1"/>
+          <w:color w:val="0000ff"/>
+          <w:sz w:val="24"/>
+          <w:szCs w:val="24"/>
+        </w:rPr>
+      </w:pPr>
+      <w:r>
+        <w:rPr>
+          <w:b w:val="1"/>
+          <w:bCs w:val="1"/>
+          <w:sz w:val="24"/>
+          <w:szCs w:val="24"/>
+          <w:rtl w:val="0"/>
+        </w:rPr>
+        <w:t xml:space="preserve">   </w:t>
+      </w:r>
+      <w:r>
+        <w:rPr>
+          <w:b w:val="1"/>
+          <w:bCs w:val="1"/>
+          <w:sz w:val="24"/>
+          <w:szCs w:val="24"/>
+          <w:rtl w:val="0"/>
+        </w:rPr>
+        <w:t xml:space="preserve">Requisitos suplementares</w:t>
+      </w:r>
+      <w:r>
+        <w:rPr>
+          <w:rtl w:val="0"/>
+        </w:rPr>
+      </w:r>
+    </w:p>
+    <w:p>
+      <w:pPr>
+        <w:numPr>
+          <w:ilvl w:val="0"/>
+          <w:numId w:val="3"/>
+        </w:numPr>
+        <w:spacing w:after="0" w:afterAutospacing="0" w:before="200" w:lineRule="auto"/>
+        <w:ind w:left="720" w:hanging="360"/>
+        <w:jc w:val="both"/>
+        <w:rPr>
+          <w:sz w:val="24"/>
+          <w:szCs w:val="24"/>
+        </w:rPr>
+      </w:pPr>
+      <w:r>
+        <w:rPr>
+          <w:sz w:val="24"/>
+          <w:szCs w:val="24"/>
+          <w:rtl w:val="0"/>
+        </w:rPr>
+        <w:t xml:space="preserve">Segurança de acesso</w:t>
+      </w:r>
+    </w:p>
+    <w:p>
+      <w:pPr>
+        <w:numPr>
+          <w:ilvl w:val="0"/>
+          <w:numId w:val="3"/>
+        </w:numPr>
+        <w:spacing w:after="0" w:afterAutospacing="0" w:before="0" w:beforeAutospacing="0" w:lineRule="auto"/>
+        <w:ind w:left="720" w:hanging="360"/>
+        <w:jc w:val="both"/>
+        <w:rPr>
+          <w:sz w:val="24"/>
+          <w:szCs w:val="24"/>
+        </w:rPr>
+      </w:pPr>
+      <w:r>
+        <w:rPr>
+          <w:sz w:val="24"/>
+          <w:szCs w:val="24"/>
+          <w:rtl w:val="0"/>
+        </w:rPr>
+        <w:t xml:space="preserve">Controle de perfil de usuário</w:t>
+      </w:r>
+    </w:p>
+    <w:p>
+      <w:pPr>
+        <w:numPr>
+          <w:ilvl w:val="0"/>
+          <w:numId w:val="3"/>
+        </w:numPr>
+        <w:spacing w:after="0" w:afterAutospacing="0" w:before="0" w:beforeAutospacing="0" w:lineRule="auto"/>
+        <w:ind w:left="720" w:hanging="360"/>
+        <w:jc w:val="both"/>
+        <w:rPr>
+          <w:sz w:val="24"/>
+          <w:szCs w:val="24"/>
+        </w:rPr>
+      </w:pPr>
+      <w:r>
+        <w:rPr>
+          <w:sz w:val="24"/>
+          <w:szCs w:val="24"/>
+          <w:rtl w:val="0"/>
+        </w:rPr>
+        <w:t xml:space="preserve">Banco de dados</w:t>
+      </w:r>
+    </w:p>
+    <w:p>
+      <w:pPr>
+        <w:numPr>
+          <w:ilvl w:val="0"/>
+          <w:numId w:val="3"/>
+        </w:numPr>
+        <w:spacing w:after="0" w:afterAutospacing="0" w:before="0" w:beforeAutospacing="0" w:lineRule="auto"/>
+        <w:ind w:left="720" w:hanging="360"/>
+        <w:jc w:val="both"/>
+        <w:rPr>
+          <w:sz w:val="24"/>
+          <w:szCs w:val="24"/>
+        </w:rPr>
+      </w:pPr>
+      <w:r>
+        <w:rPr>
+          <w:sz w:val="24"/>
+          <w:szCs w:val="24"/>
+          <w:rtl w:val="0"/>
+        </w:rPr>
+        <w:t xml:space="preserve">Ambiente interno</w:t>
+      </w:r>
+    </w:p>
+    <w:p>
+      <w:pPr>
+        <w:numPr>
+          <w:ilvl w:val="0"/>
+          <w:numId w:val="3"/>
+        </w:numPr>
+        <w:spacing w:after="0" w:afterAutospacing="0" w:before="0" w:beforeAutospacing="0" w:lineRule="auto"/>
+        <w:ind w:left="720" w:hanging="360"/>
+        <w:jc w:val="both"/>
+        <w:rPr>
+          <w:sz w:val="24"/>
+          <w:szCs w:val="24"/>
+        </w:rPr>
+      </w:pPr>
+      <w:r>
+        <w:rPr>
+          <w:sz w:val="24"/>
+          <w:szCs w:val="24"/>
+          <w:rtl w:val="0"/>
+        </w:rPr>
+        <w:t xml:space="preserve">Restrição de escopo</w:t>
+      </w:r>
+    </w:p>
+    <w:p>
+      <w:pPr>
+        <w:numPr>
+          <w:ilvl w:val="0"/>
+          <w:numId w:val="3"/>
+        </w:numPr>
+        <w:spacing w:after="200" w:before="0" w:beforeAutospacing="0" w:lineRule="auto"/>
+        <w:ind w:left="720" w:hanging="360"/>
+        <w:jc w:val="both"/>
+        <w:rPr>
+          <w:sz w:val="24"/>
+          <w:szCs w:val="24"/>
+        </w:rPr>
+      </w:pPr>
+      <w:r>
+        <w:rPr>
+          <w:sz w:val="24"/>
+          <w:szCs w:val="24"/>
+          <w:rtl w:val="0"/>
+        </w:rPr>
+        <w:t xml:space="preserve">Integridade dos dados</w:t>
+      </w:r>
+      <w:r>
+        <w:rPr>
+          <w:rtl w:val="0"/>
+        </w:rPr>
       </w:r>
     </w:p>
     <w:p>
@@ -1400,8 +1826,234 @@
       </w:rPr>
     </w:lvl>
   </w:abstractNum>
+  <w:abstractNum w:abstractNumId="2">
+    <w:lvl w:ilvl="0">
+      <w:start w:val="1"/>
+      <w:numFmt w:val="decimal"/>
+      <w:lvlText w:val="%1."/>
+      <w:lvlJc w:val="left"/>
+      <w:pPr>
+        <w:ind w:left="720" w:hanging="360"/>
+      </w:pPr>
+      <w:rPr>
+        <w:u w:val="none"/>
+      </w:rPr>
+    </w:lvl>
+    <w:lvl w:ilvl="1">
+      <w:start w:val="1"/>
+      <w:numFmt w:val="lowerLetter"/>
+      <w:lvlText w:val="%2."/>
+      <w:lvlJc w:val="left"/>
+      <w:pPr>
+        <w:ind w:left="1440" w:hanging="360"/>
+      </w:pPr>
+      <w:rPr>
+        <w:u w:val="none"/>
+      </w:rPr>
+    </w:lvl>
+    <w:lvl w:ilvl="2">
+      <w:start w:val="1"/>
+      <w:numFmt w:val="lowerRoman"/>
+      <w:lvlText w:val="%3."/>
+      <w:lvlJc w:val="right"/>
+      <w:pPr>
+        <w:ind w:left="2160" w:hanging="360"/>
+      </w:pPr>
+      <w:rPr>
+        <w:u w:val="none"/>
+      </w:rPr>
+    </w:lvl>
+    <w:lvl w:ilvl="3">
+      <w:start w:val="1"/>
+      <w:numFmt w:val="decimal"/>
+      <w:lvlText w:val="%4."/>
+      <w:lvlJc w:val="left"/>
+      <w:pPr>
+        <w:ind w:left="2880" w:hanging="360"/>
+      </w:pPr>
+      <w:rPr>
+        <w:u w:val="none"/>
+      </w:rPr>
+    </w:lvl>
+    <w:lvl w:ilvl="4">
+      <w:start w:val="1"/>
+      <w:numFmt w:val="lowerLetter"/>
+      <w:lvlText w:val="%5."/>
+      <w:lvlJc w:val="left"/>
+      <w:pPr>
+        <w:ind w:left="3600" w:hanging="360"/>
+      </w:pPr>
+      <w:rPr>
+        <w:u w:val="none"/>
+      </w:rPr>
+    </w:lvl>
+    <w:lvl w:ilvl="5">
+      <w:start w:val="1"/>
+      <w:numFmt w:val="lowerRoman"/>
+      <w:lvlText w:val="%6."/>
+      <w:lvlJc w:val="right"/>
+      <w:pPr>
+        <w:ind w:left="4320" w:hanging="360"/>
+      </w:pPr>
+      <w:rPr>
+        <w:u w:val="none"/>
+      </w:rPr>
+    </w:lvl>
+    <w:lvl w:ilvl="6">
+      <w:start w:val="1"/>
+      <w:numFmt w:val="decimal"/>
+      <w:lvlText w:val="%7."/>
+      <w:lvlJc w:val="left"/>
+      <w:pPr>
+        <w:ind w:left="5040" w:hanging="360"/>
+      </w:pPr>
+      <w:rPr>
+        <w:u w:val="none"/>
+      </w:rPr>
+    </w:lvl>
+    <w:lvl w:ilvl="7">
+      <w:start w:val="1"/>
+      <w:numFmt w:val="lowerLetter"/>
+      <w:lvlText w:val="%8."/>
+      <w:lvlJc w:val="left"/>
+      <w:pPr>
+        <w:ind w:left="5760" w:hanging="360"/>
+      </w:pPr>
+      <w:rPr>
+        <w:u w:val="none"/>
+      </w:rPr>
+    </w:lvl>
+    <w:lvl w:ilvl="8">
+      <w:start w:val="1"/>
+      <w:numFmt w:val="lowerRoman"/>
+      <w:lvlText w:val="%9."/>
+      <w:lvlJc w:val="right"/>
+      <w:pPr>
+        <w:ind w:left="6480" w:hanging="360"/>
+      </w:pPr>
+      <w:rPr>
+        <w:u w:val="none"/>
+      </w:rPr>
+    </w:lvl>
+  </w:abstractNum>
+  <w:abstractNum w:abstractNumId="3">
+    <w:lvl w:ilvl="0">
+      <w:start w:val="1"/>
+      <w:numFmt w:val="decimal"/>
+      <w:lvlText w:val="%1."/>
+      <w:lvlJc w:val="left"/>
+      <w:pPr>
+        <w:ind w:left="720" w:hanging="360"/>
+      </w:pPr>
+      <w:rPr>
+        <w:u w:val="none"/>
+      </w:rPr>
+    </w:lvl>
+    <w:lvl w:ilvl="1">
+      <w:start w:val="1"/>
+      <w:numFmt w:val="lowerLetter"/>
+      <w:lvlText w:val="%2."/>
+      <w:lvlJc w:val="left"/>
+      <w:pPr>
+        <w:ind w:left="1440" w:hanging="360"/>
+      </w:pPr>
+      <w:rPr>
+        <w:u w:val="none"/>
+      </w:rPr>
+    </w:lvl>
+    <w:lvl w:ilvl="2">
+      <w:start w:val="1"/>
+      <w:numFmt w:val="lowerRoman"/>
+      <w:lvlText w:val="%3."/>
+      <w:lvlJc w:val="right"/>
+      <w:pPr>
+        <w:ind w:left="2160" w:hanging="360"/>
+      </w:pPr>
+      <w:rPr>
+        <w:u w:val="none"/>
+      </w:rPr>
+    </w:lvl>
+    <w:lvl w:ilvl="3">
+      <w:start w:val="1"/>
+      <w:numFmt w:val="decimal"/>
+      <w:lvlText w:val="%4."/>
+      <w:lvlJc w:val="left"/>
+      <w:pPr>
+        <w:ind w:left="2880" w:hanging="360"/>
+      </w:pPr>
+      <w:rPr>
+        <w:u w:val="none"/>
+      </w:rPr>
+    </w:lvl>
+    <w:lvl w:ilvl="4">
+      <w:start w:val="1"/>
+      <w:numFmt w:val="lowerLetter"/>
+      <w:lvlText w:val="%5."/>
+      <w:lvlJc w:val="left"/>
+      <w:pPr>
+        <w:ind w:left="3600" w:hanging="360"/>
+      </w:pPr>
+      <w:rPr>
+        <w:u w:val="none"/>
+      </w:rPr>
+    </w:lvl>
+    <w:lvl w:ilvl="5">
+      <w:start w:val="1"/>
+      <w:numFmt w:val="lowerRoman"/>
+      <w:lvlText w:val="%6."/>
+      <w:lvlJc w:val="right"/>
+      <w:pPr>
+        <w:ind w:left="4320" w:hanging="360"/>
+      </w:pPr>
+      <w:rPr>
+        <w:u w:val="none"/>
+      </w:rPr>
+    </w:lvl>
+    <w:lvl w:ilvl="6">
+      <w:start w:val="1"/>
+      <w:numFmt w:val="decimal"/>
+      <w:lvlText w:val="%7."/>
+      <w:lvlJc w:val="left"/>
+      <w:pPr>
+        <w:ind w:left="5040" w:hanging="360"/>
+      </w:pPr>
+      <w:rPr>
+        <w:u w:val="none"/>
+      </w:rPr>
+    </w:lvl>
+    <w:lvl w:ilvl="7">
+      <w:start w:val="1"/>
+      <w:numFmt w:val="lowerLetter"/>
+      <w:lvlText w:val="%8."/>
+      <w:lvlJc w:val="left"/>
+      <w:pPr>
+        <w:ind w:left="5760" w:hanging="360"/>
+      </w:pPr>
+      <w:rPr>
+        <w:u w:val="none"/>
+      </w:rPr>
+    </w:lvl>
+    <w:lvl w:ilvl="8">
+      <w:start w:val="1"/>
+      <w:numFmt w:val="lowerRoman"/>
+      <w:lvlText w:val="%9."/>
+      <w:lvlJc w:val="right"/>
+      <w:pPr>
+        <w:ind w:left="6480" w:hanging="360"/>
+      </w:pPr>
+      <w:rPr>
+        <w:u w:val="none"/>
+      </w:rPr>
+    </w:lvl>
+  </w:abstractNum>
   <w:num w:numId="1">
     <w:abstractNumId w:val="1"/>
+  </w:num>
+  <w:num w:numId="2">
+    <w:abstractNumId w:val="2"/>
+  </w:num>
+  <w:num w:numId="3">
+    <w:abstractNumId w:val="3"/>
   </w:num>
 </w:numbering>
 </file>

</xml_diff>